<commit_message>
Update walkthrough, implementation plan (MD & DOCX), CV, and Android assets with Rahat's customized pre-production experience
</commit_message>
<xml_diff>
--- a/implementation_plan.docx
+++ b/implementation_plan.docx
@@ -304,6 +304,279 @@
       </w:pPr>
       <w:r>
         <w:t>**DB Console**: `POST /api/db/query` (run custom SQL queries and return tabular results)</w:t>
+      </w:r>
+    </w:p>
+    <w:p>
+      <w:pPr>
+        <w:jc w:val="center"/>
+      </w:pPr>
+      <w:r>
+        <w:t>────────────────────────────────────────</w:t>
+      </w:r>
+    </w:p>
+    <w:p>
+      <w:pPr>
+        <w:pStyle w:val="Heading3"/>
+      </w:pPr>
+      <w:r>
+        <w:t>Database Schema Design</w:t>
+      </w:r>
+    </w:p>
+    <w:p>
+      <w:r>
+        <w:t>The file-based SQLite database (</w:t>
+      </w:r>
+      <w:r>
+        <w:rPr>
+          <w:rFonts w:ascii="Consolas" w:hAnsi="Consolas"/>
+          <w:color w:val="C7254E"/>
+          <w:sz w:val="19"/>
+        </w:rPr>
+        <w:t>database.sqlite</w:t>
+      </w:r>
+      <w:r>
+        <w:t>) contains four tables organized as follows:</w:t>
+        <w:br/>
+      </w:r>
+    </w:p>
+    <w:p>
+      <w:pPr>
+        <w:pStyle w:val="Heading4"/>
+      </w:pPr>
+      <w:r>
+        <w:t>1. `users` Table</w:t>
+      </w:r>
+    </w:p>
+    <w:p>
+      <w:r>
+        <w:t>Stores system user accounts with hashed credentials.</w:t>
+        <w:br/>
+      </w:r>
+    </w:p>
+    <w:p>
+      <w:pPr>
+        <w:pStyle w:val="ListBullet"/>
+      </w:pPr>
+      <w:r>
+        <w:t>`id` (INTEGER PRIMARY KEY AUTOINCREMENT)</w:t>
+      </w:r>
+    </w:p>
+    <w:p>
+      <w:pPr>
+        <w:pStyle w:val="ListBullet"/>
+      </w:pPr>
+      <w:r>
+        <w:t>`username` (TEXT UNIQUE NOT NULL)</w:t>
+      </w:r>
+    </w:p>
+    <w:p>
+      <w:pPr>
+        <w:pStyle w:val="ListBullet"/>
+      </w:pPr>
+      <w:r>
+        <w:t>`password` (TEXT NOT NULL) — hashed with bcryptjs (salt rounds = 10)</w:t>
+      </w:r>
+    </w:p>
+    <w:p>
+      <w:pPr>
+        <w:pStyle w:val="Heading4"/>
+      </w:pPr>
+      <w:r>
+        <w:t>2. `jobs` Table</w:t>
+      </w:r>
+    </w:p>
+    <w:p>
+      <w:r>
+        <w:t>Stores job tracking entries for the Kanban Board.</w:t>
+        <w:br/>
+      </w:r>
+    </w:p>
+    <w:p>
+      <w:pPr>
+        <w:pStyle w:val="ListBullet"/>
+      </w:pPr>
+      <w:r>
+        <w:t>`id` (TEXT PRIMARY KEY) — unique client-generated UUID</w:t>
+      </w:r>
+    </w:p>
+    <w:p>
+      <w:pPr>
+        <w:pStyle w:val="ListBullet"/>
+      </w:pPr>
+      <w:r>
+        <w:t>`title` (TEXT NOT NULL) — job position name</w:t>
+      </w:r>
+    </w:p>
+    <w:p>
+      <w:pPr>
+        <w:pStyle w:val="ListBullet"/>
+      </w:pPr>
+      <w:r>
+        <w:t>`company` (TEXT NOT NULL) — employer organization name</w:t>
+      </w:r>
+    </w:p>
+    <w:p>
+      <w:pPr>
+        <w:pStyle w:val="ListBullet"/>
+      </w:pPr>
+      <w:r>
+        <w:t>`location` (TEXT) — job location</w:t>
+      </w:r>
+    </w:p>
+    <w:p>
+      <w:pPr>
+        <w:pStyle w:val="ListBullet"/>
+      </w:pPr>
+      <w:r>
+        <w:t>`salary` (TEXT) — salary details</w:t>
+      </w:r>
+    </w:p>
+    <w:p>
+      <w:pPr>
+        <w:pStyle w:val="ListBullet"/>
+      </w:pPr>
+      <w:r>
+        <w:t>`url` (TEXT) — listing source URL</w:t>
+      </w:r>
+    </w:p>
+    <w:p>
+      <w:pPr>
+        <w:pStyle w:val="ListBullet"/>
+      </w:pPr>
+      <w:r>
+        <w:t>`source` (TEXT) — website or channel name</w:t>
+      </w:r>
+    </w:p>
+    <w:p>
+      <w:pPr>
+        <w:pStyle w:val="ListBullet"/>
+      </w:pPr>
+      <w:r>
+        <w:t>`deadline` (TEXT) — application deadline date</w:t>
+      </w:r>
+    </w:p>
+    <w:p>
+      <w:pPr>
+        <w:pStyle w:val="ListBullet"/>
+      </w:pPr>
+      <w:r>
+        <w:t>`notes` (TEXT) — candidate notes</w:t>
+      </w:r>
+    </w:p>
+    <w:p>
+      <w:pPr>
+        <w:pStyle w:val="ListBullet"/>
+      </w:pPr>
+      <w:r>
+        <w:t>`stage` (TEXT NOT NULL) — current Kanban stage (`saved`, `applied`, `interview`, `offer`, `rejected`)</w:t>
+      </w:r>
+    </w:p>
+    <w:p>
+      <w:pPr>
+        <w:pStyle w:val="ListBullet"/>
+      </w:pPr>
+      <w:r>
+        <w:t>`user_id` (INTEGER, FOREIGN KEY referencing `users(id)`)</w:t>
+      </w:r>
+    </w:p>
+    <w:p>
+      <w:pPr>
+        <w:pStyle w:val="ListBullet"/>
+      </w:pPr>
+      <w:r>
+        <w:t>`created_at` (TEXT) — record creation timestamp</w:t>
+      </w:r>
+    </w:p>
+    <w:p>
+      <w:pPr>
+        <w:pStyle w:val="Heading4"/>
+      </w:pPr>
+      <w:r>
+        <w:t>3. `linkedin_checklist` Table</w:t>
+      </w:r>
+    </w:p>
+    <w:p>
+      <w:r>
+        <w:t>Tracks checked state of LinkedIn profile items.</w:t>
+        <w:br/>
+      </w:r>
+    </w:p>
+    <w:p>
+      <w:pPr>
+        <w:pStyle w:val="ListBullet"/>
+      </w:pPr>
+      <w:r>
+        <w:t>`item_id` (TEXT NOT NULL) — key of the checklist item matching `data.js`</w:t>
+      </w:r>
+    </w:p>
+    <w:p>
+      <w:pPr>
+        <w:pStyle w:val="ListBullet"/>
+      </w:pPr>
+      <w:r>
+        <w:t>`user_id` (INTEGER NOT NULL, FOREIGN KEY referencing `users(id)`)</w:t>
+      </w:r>
+    </w:p>
+    <w:p>
+      <w:pPr>
+        <w:pStyle w:val="ListBullet"/>
+      </w:pPr>
+      <w:r>
+        <w:t>`done` (INTEGER DEFAULT 0) — binary checked status (1 = done, 0 = active)</w:t>
+      </w:r>
+    </w:p>
+    <w:p>
+      <w:pPr>
+        <w:pStyle w:val="ListBullet"/>
+      </w:pPr>
+      <w:r>
+        <w:t>Primary Key: `(item_id, user_id)`</w:t>
+      </w:r>
+    </w:p>
+    <w:p>
+      <w:pPr>
+        <w:pStyle w:val="Heading4"/>
+      </w:pPr>
+      <w:r>
+        <w:t>4. `action_plan` Table</w:t>
+      </w:r>
+    </w:p>
+    <w:p>
+      <w:r>
+        <w:t>Tracks task checklist progress for the 4-week preparation plan.</w:t>
+        <w:br/>
+      </w:r>
+    </w:p>
+    <w:p>
+      <w:pPr>
+        <w:pStyle w:val="ListBullet"/>
+      </w:pPr>
+      <w:r>
+        <w:t>`task_key` (TEXT NOT NULL) — composite key identifying week and task number</w:t>
+      </w:r>
+    </w:p>
+    <w:p>
+      <w:pPr>
+        <w:pStyle w:val="ListBullet"/>
+      </w:pPr>
+      <w:r>
+        <w:t>`user_id` (INTEGER NOT NULL, FOREIGN KEY referencing `users(id)`)</w:t>
+      </w:r>
+    </w:p>
+    <w:p>
+      <w:pPr>
+        <w:pStyle w:val="ListBullet"/>
+      </w:pPr>
+      <w:r>
+        <w:t>`done` (INTEGER DEFAULT 0) — binary checked status (1 = done, 0 = active)</w:t>
+      </w:r>
+    </w:p>
+    <w:p>
+      <w:pPr>
+        <w:pStyle w:val="ListBullet"/>
+      </w:pPr>
+      <w:r>
+        <w:t>Primary Key: `(task_key, user_id)`</w:t>
       </w:r>
     </w:p>
     <w:p>

</xml_diff>